<commit_message>
update the scrum doc
</commit_message>
<xml_diff>
--- a/Assignment2/G9_SprintBacklog.docx
+++ b/Assignment2/G9_SprintBacklog.docx
@@ -671,6 +671,14 @@
               </w:rPr>
               <w:t>PBL</w:t>
             </w:r>
+            <w:r>
+              <w:rPr>
+                <w:rFonts w:asciiTheme="minorBidi" w:hAnsiTheme="minorBidi"/>
+                <w:sz w:val="24"/>
+                <w:szCs w:val="24"/>
+              </w:rPr>
+              <w:t xml:space="preserve"> 2</w:t>
+            </w:r>
           </w:p>
         </w:tc>
         <w:tc>
@@ -778,6 +786,14 @@
               </w:rPr>
               <w:t>PBL</w:t>
             </w:r>
+            <w:r>
+              <w:rPr>
+                <w:rFonts w:asciiTheme="minorBidi" w:hAnsiTheme="minorBidi"/>
+                <w:sz w:val="24"/>
+                <w:szCs w:val="24"/>
+              </w:rPr>
+              <w:t xml:space="preserve"> 3</w:t>
+            </w:r>
           </w:p>
         </w:tc>
         <w:tc>
@@ -885,6 +901,14 @@
               </w:rPr>
               <w:t>PBL</w:t>
             </w:r>
+            <w:r>
+              <w:rPr>
+                <w:rFonts w:asciiTheme="minorBidi" w:hAnsiTheme="minorBidi"/>
+                <w:sz w:val="24"/>
+                <w:szCs w:val="24"/>
+              </w:rPr>
+              <w:t xml:space="preserve"> 4</w:t>
+            </w:r>
           </w:p>
         </w:tc>
         <w:tc>
@@ -983,6 +1007,14 @@
               </w:rPr>
               <w:t>PBL</w:t>
             </w:r>
+            <w:r>
+              <w:rPr>
+                <w:rFonts w:asciiTheme="minorBidi" w:hAnsiTheme="minorBidi"/>
+                <w:sz w:val="24"/>
+                <w:szCs w:val="24"/>
+              </w:rPr>
+              <w:t xml:space="preserve"> 5</w:t>
+            </w:r>
           </w:p>
         </w:tc>
         <w:tc>
@@ -1081,6 +1113,14 @@
               </w:rPr>
               <w:t>PBL</w:t>
             </w:r>
+            <w:r>
+              <w:rPr>
+                <w:rFonts w:asciiTheme="minorBidi" w:hAnsiTheme="minorBidi"/>
+                <w:sz w:val="24"/>
+                <w:szCs w:val="24"/>
+              </w:rPr>
+              <w:t xml:space="preserve"> 6</w:t>
+            </w:r>
           </w:p>
         </w:tc>
         <w:tc>
@@ -1179,6 +1219,14 @@
               </w:rPr>
               <w:t>PBL</w:t>
             </w:r>
+            <w:r>
+              <w:rPr>
+                <w:rFonts w:asciiTheme="minorBidi" w:hAnsiTheme="minorBidi"/>
+                <w:sz w:val="24"/>
+                <w:szCs w:val="24"/>
+              </w:rPr>
+              <w:t xml:space="preserve"> 7</w:t>
+            </w:r>
           </w:p>
         </w:tc>
         <w:tc>
@@ -1286,6 +1334,14 @@
               </w:rPr>
               <w:t>PBL</w:t>
             </w:r>
+            <w:r>
+              <w:rPr>
+                <w:rFonts w:asciiTheme="minorBidi" w:hAnsiTheme="minorBidi"/>
+                <w:sz w:val="24"/>
+                <w:szCs w:val="24"/>
+              </w:rPr>
+              <w:t xml:space="preserve"> 8</w:t>
+            </w:r>
           </w:p>
         </w:tc>
         <w:tc>
@@ -1402,6 +1458,14 @@
               </w:rPr>
               <w:t>PBL</w:t>
             </w:r>
+            <w:r>
+              <w:rPr>
+                <w:rFonts w:asciiTheme="minorBidi" w:hAnsiTheme="minorBidi"/>
+                <w:sz w:val="24"/>
+                <w:szCs w:val="24"/>
+              </w:rPr>
+              <w:t xml:space="preserve"> 9</w:t>
+            </w:r>
           </w:p>
         </w:tc>
         <w:tc>
@@ -1500,6 +1564,14 @@
               </w:rPr>
               <w:t>PBL</w:t>
             </w:r>
+            <w:r>
+              <w:rPr>
+                <w:rFonts w:asciiTheme="minorBidi" w:hAnsiTheme="minorBidi"/>
+                <w:sz w:val="24"/>
+                <w:szCs w:val="24"/>
+              </w:rPr>
+              <w:t xml:space="preserve"> 10</w:t>
+            </w:r>
           </w:p>
         </w:tc>
         <w:tc>
@@ -1572,591 +1644,6 @@
               </w:rPr>
               <w:t>Shaked Malul</w:t>
             </w:r>
-          </w:p>
-        </w:tc>
-      </w:tr>
-      <w:tr>
-        <w:tc>
-          <w:tcPr>
-            <w:tcW w:w="596" w:type="pct"/>
-            <w:vAlign w:val="center"/>
-          </w:tcPr>
-          <w:p>
-            <w:pPr>
-              <w:bidi w:val="0"/>
-              <w:rPr>
-                <w:rFonts w:asciiTheme="minorBidi" w:hAnsiTheme="minorBidi"/>
-                <w:sz w:val="24"/>
-                <w:szCs w:val="24"/>
-              </w:rPr>
-            </w:pPr>
-            <w:r>
-              <w:rPr>
-                <w:rFonts w:asciiTheme="minorBidi" w:hAnsiTheme="minorBidi"/>
-                <w:color w:val="FF0000"/>
-                <w:sz w:val="24"/>
-                <w:szCs w:val="24"/>
-              </w:rPr>
-              <w:t>PBL</w:t>
-            </w:r>
-          </w:p>
-        </w:tc>
-        <w:tc>
-          <w:tcPr>
-            <w:tcW w:w="2302" w:type="pct"/>
-            <w:vAlign w:val="center"/>
-          </w:tcPr>
-          <w:p>
-            <w:pPr>
-              <w:bidi w:val="0"/>
-              <w:rPr>
-                <w:rFonts w:asciiTheme="minorBidi" w:hAnsiTheme="minorBidi"/>
-                <w:sz w:val="24"/>
-                <w:szCs w:val="24"/>
-              </w:rPr>
-            </w:pPr>
-            <w:r>
-              <w:rPr>
-                <w:rFonts w:asciiTheme="minorBidi" w:hAnsiTheme="minorBidi"/>
-                <w:color w:val="FF0000"/>
-                <w:sz w:val="24"/>
-                <w:szCs w:val="24"/>
-              </w:rPr>
-              <w:t>As a system, I want to direct a customer to a table immediately if a table is available when requesting a wait.</w:t>
-            </w:r>
-          </w:p>
-        </w:tc>
-        <w:tc>
-          <w:tcPr>
-            <w:tcW w:w="893" w:type="pct"/>
-          </w:tcPr>
-          <w:p>
-            <w:pPr>
-              <w:bidi w:val="0"/>
-              <w:rPr>
-                <w:rFonts w:asciiTheme="minorBidi" w:hAnsiTheme="minorBidi"/>
-                <w:sz w:val="24"/>
-                <w:szCs w:val="24"/>
-              </w:rPr>
-            </w:pPr>
-          </w:p>
-        </w:tc>
-        <w:tc>
-          <w:tcPr>
-            <w:tcW w:w="1209" w:type="pct"/>
-            <w:vAlign w:val="center"/>
-          </w:tcPr>
-          <w:p>
-            <w:pPr>
-              <w:bidi w:val="0"/>
-              <w:rPr>
-                <w:rFonts w:asciiTheme="minorBidi" w:hAnsiTheme="minorBidi"/>
-                <w:sz w:val="24"/>
-                <w:szCs w:val="24"/>
-              </w:rPr>
-            </w:pPr>
-          </w:p>
-        </w:tc>
-      </w:tr>
-      <w:tr>
-        <w:tc>
-          <w:tcPr>
-            <w:tcW w:w="596" w:type="pct"/>
-            <w:vAlign w:val="center"/>
-          </w:tcPr>
-          <w:p>
-            <w:pPr>
-              <w:bidi w:val="0"/>
-              <w:rPr>
-                <w:rFonts w:asciiTheme="minorBidi" w:hAnsiTheme="minorBidi"/>
-                <w:sz w:val="24"/>
-                <w:szCs w:val="24"/>
-              </w:rPr>
-            </w:pPr>
-            <w:r>
-              <w:rPr>
-                <w:rFonts w:asciiTheme="minorBidi" w:hAnsiTheme="minorBidi"/>
-                <w:color w:val="FF0000"/>
-                <w:sz w:val="24"/>
-                <w:szCs w:val="24"/>
-              </w:rPr>
-              <w:t>PBL</w:t>
-            </w:r>
-          </w:p>
-        </w:tc>
-        <w:tc>
-          <w:tcPr>
-            <w:tcW w:w="2302" w:type="pct"/>
-            <w:vAlign w:val="center"/>
-          </w:tcPr>
-          <w:p>
-            <w:pPr>
-              <w:bidi w:val="0"/>
-              <w:rPr>
-                <w:rFonts w:asciiTheme="minorBidi" w:hAnsiTheme="minorBidi"/>
-                <w:sz w:val="24"/>
-                <w:szCs w:val="24"/>
-              </w:rPr>
-            </w:pPr>
-            <w:r>
-              <w:rPr>
-                <w:rFonts w:asciiTheme="minorBidi" w:hAnsiTheme="minorBidi"/>
-                <w:color w:val="FF0000"/>
-                <w:sz w:val="24"/>
-                <w:szCs w:val="24"/>
-              </w:rPr>
-              <w:t>As a subscriber, I want to identify myself at the entrance using a tag reader or terminal.</w:t>
-            </w:r>
-          </w:p>
-        </w:tc>
-        <w:tc>
-          <w:tcPr>
-            <w:tcW w:w="893" w:type="pct"/>
-          </w:tcPr>
-          <w:p>
-            <w:pPr>
-              <w:bidi w:val="0"/>
-              <w:rPr>
-                <w:rFonts w:asciiTheme="minorBidi" w:hAnsiTheme="minorBidi"/>
-                <w:sz w:val="24"/>
-                <w:szCs w:val="24"/>
-              </w:rPr>
-            </w:pPr>
-          </w:p>
-        </w:tc>
-        <w:tc>
-          <w:tcPr>
-            <w:tcW w:w="1209" w:type="pct"/>
-            <w:vAlign w:val="center"/>
-          </w:tcPr>
-          <w:p>
-            <w:pPr>
-              <w:bidi w:val="0"/>
-              <w:rPr>
-                <w:rFonts w:asciiTheme="minorBidi" w:hAnsiTheme="minorBidi"/>
-                <w:sz w:val="24"/>
-                <w:szCs w:val="24"/>
-              </w:rPr>
-            </w:pPr>
-          </w:p>
-        </w:tc>
-      </w:tr>
-      <w:tr>
-        <w:tc>
-          <w:tcPr>
-            <w:tcW w:w="596" w:type="pct"/>
-            <w:vAlign w:val="center"/>
-          </w:tcPr>
-          <w:p>
-            <w:pPr>
-              <w:bidi w:val="0"/>
-              <w:rPr>
-                <w:rFonts w:asciiTheme="minorBidi" w:hAnsiTheme="minorBidi"/>
-                <w:sz w:val="24"/>
-                <w:szCs w:val="24"/>
-              </w:rPr>
-            </w:pPr>
-            <w:r>
-              <w:rPr>
-                <w:rFonts w:asciiTheme="minorBidi" w:hAnsiTheme="minorBidi"/>
-                <w:color w:val="FF0000"/>
-                <w:sz w:val="24"/>
-                <w:szCs w:val="24"/>
-              </w:rPr>
-              <w:lastRenderedPageBreak/>
-              <w:t>PBL</w:t>
-            </w:r>
-          </w:p>
-        </w:tc>
-        <w:tc>
-          <w:tcPr>
-            <w:tcW w:w="2302" w:type="pct"/>
-            <w:vAlign w:val="center"/>
-          </w:tcPr>
-          <w:p>
-            <w:pPr>
-              <w:bidi w:val="0"/>
-              <w:rPr>
-                <w:rFonts w:asciiTheme="minorBidi" w:hAnsiTheme="minorBidi"/>
-                <w:sz w:val="24"/>
-                <w:szCs w:val="24"/>
-              </w:rPr>
-            </w:pPr>
-            <w:r>
-              <w:rPr>
-                <w:rFonts w:asciiTheme="minorBidi" w:hAnsiTheme="minorBidi"/>
-                <w:color w:val="FF0000"/>
-                <w:sz w:val="24"/>
-                <w:szCs w:val="24"/>
-              </w:rPr>
-              <w:t>As a restaurant representative, I want to update the restaurant's table details (add, delete, change the number of seats)</w:t>
-            </w:r>
-          </w:p>
-        </w:tc>
-        <w:tc>
-          <w:tcPr>
-            <w:tcW w:w="893" w:type="pct"/>
-          </w:tcPr>
-          <w:p>
-            <w:pPr>
-              <w:bidi w:val="0"/>
-              <w:rPr>
-                <w:rFonts w:asciiTheme="minorBidi" w:hAnsiTheme="minorBidi"/>
-                <w:sz w:val="24"/>
-                <w:szCs w:val="24"/>
-              </w:rPr>
-            </w:pPr>
-          </w:p>
-        </w:tc>
-        <w:tc>
-          <w:tcPr>
-            <w:tcW w:w="1209" w:type="pct"/>
-            <w:vAlign w:val="center"/>
-          </w:tcPr>
-          <w:p>
-            <w:pPr>
-              <w:bidi w:val="0"/>
-              <w:rPr>
-                <w:rFonts w:asciiTheme="minorBidi" w:hAnsiTheme="minorBidi"/>
-                <w:sz w:val="24"/>
-                <w:szCs w:val="24"/>
-              </w:rPr>
-            </w:pPr>
-          </w:p>
-        </w:tc>
-      </w:tr>
-      <w:tr>
-        <w:tc>
-          <w:tcPr>
-            <w:tcW w:w="596" w:type="pct"/>
-            <w:vAlign w:val="center"/>
-          </w:tcPr>
-          <w:p>
-            <w:pPr>
-              <w:bidi w:val="0"/>
-              <w:rPr>
-                <w:rFonts w:asciiTheme="minorBidi" w:hAnsiTheme="minorBidi"/>
-                <w:sz w:val="24"/>
-                <w:szCs w:val="24"/>
-              </w:rPr>
-            </w:pPr>
-            <w:r>
-              <w:rPr>
-                <w:rFonts w:asciiTheme="minorBidi" w:hAnsiTheme="minorBidi"/>
-                <w:color w:val="FF0000"/>
-                <w:sz w:val="24"/>
-                <w:szCs w:val="24"/>
-              </w:rPr>
-              <w:t>PBL</w:t>
-            </w:r>
-          </w:p>
-        </w:tc>
-        <w:tc>
-          <w:tcPr>
-            <w:tcW w:w="2302" w:type="pct"/>
-            <w:vAlign w:val="center"/>
-          </w:tcPr>
-          <w:p>
-            <w:pPr>
-              <w:bidi w:val="0"/>
-              <w:rPr>
-                <w:rFonts w:asciiTheme="minorBidi" w:hAnsiTheme="minorBidi"/>
-                <w:sz w:val="24"/>
-                <w:szCs w:val="24"/>
-              </w:rPr>
-            </w:pPr>
-            <w:r>
-              <w:rPr>
-                <w:rFonts w:asciiTheme="minorBidi" w:hAnsiTheme="minorBidi"/>
-                <w:color w:val="FF0000"/>
-                <w:sz w:val="24"/>
-                <w:szCs w:val="24"/>
-              </w:rPr>
-              <w:t>As a restaurant representative, I want to view the waiting list and a breakdown of all orders.</w:t>
-            </w:r>
-          </w:p>
-        </w:tc>
-        <w:tc>
-          <w:tcPr>
-            <w:tcW w:w="893" w:type="pct"/>
-          </w:tcPr>
-          <w:p>
-            <w:pPr>
-              <w:bidi w:val="0"/>
-              <w:rPr>
-                <w:rFonts w:asciiTheme="minorBidi" w:hAnsiTheme="minorBidi"/>
-                <w:sz w:val="24"/>
-                <w:szCs w:val="24"/>
-              </w:rPr>
-            </w:pPr>
-          </w:p>
-        </w:tc>
-        <w:tc>
-          <w:tcPr>
-            <w:tcW w:w="1209" w:type="pct"/>
-            <w:vAlign w:val="center"/>
-          </w:tcPr>
-          <w:p>
-            <w:pPr>
-              <w:bidi w:val="0"/>
-              <w:rPr>
-                <w:rFonts w:asciiTheme="minorBidi" w:hAnsiTheme="minorBidi"/>
-                <w:sz w:val="24"/>
-                <w:szCs w:val="24"/>
-              </w:rPr>
-            </w:pPr>
-          </w:p>
-        </w:tc>
-      </w:tr>
-      <w:tr>
-        <w:tc>
-          <w:tcPr>
-            <w:tcW w:w="596" w:type="pct"/>
-            <w:vAlign w:val="center"/>
-          </w:tcPr>
-          <w:p>
-            <w:pPr>
-              <w:bidi w:val="0"/>
-              <w:rPr>
-                <w:rFonts w:asciiTheme="minorBidi" w:hAnsiTheme="minorBidi"/>
-                <w:color w:val="FF0000"/>
-                <w:sz w:val="24"/>
-                <w:szCs w:val="24"/>
-              </w:rPr>
-            </w:pPr>
-            <w:r>
-              <w:rPr>
-                <w:rFonts w:asciiTheme="minorBidi" w:hAnsiTheme="minorBidi"/>
-                <w:color w:val="FF0000"/>
-                <w:sz w:val="24"/>
-                <w:szCs w:val="24"/>
-              </w:rPr>
-              <w:t>PBL</w:t>
-            </w:r>
-          </w:p>
-        </w:tc>
-        <w:tc>
-          <w:tcPr>
-            <w:tcW w:w="2302" w:type="pct"/>
-            <w:vAlign w:val="center"/>
-          </w:tcPr>
-          <w:p>
-            <w:pPr>
-              <w:bidi w:val="0"/>
-              <w:rPr>
-                <w:rFonts w:asciiTheme="minorBidi" w:hAnsiTheme="minorBidi"/>
-                <w:sz w:val="24"/>
-                <w:szCs w:val="24"/>
-              </w:rPr>
-            </w:pPr>
-            <w:r>
-              <w:rPr>
-                <w:rFonts w:asciiTheme="minorBidi" w:hAnsiTheme="minorBidi"/>
-                <w:color w:val="FF0000"/>
-                <w:sz w:val="24"/>
-                <w:szCs w:val="24"/>
-              </w:rPr>
-              <w:t>As a restaurant representative, I want to view the waiting list and a breakdown of all orders.</w:t>
-            </w:r>
-          </w:p>
-        </w:tc>
-        <w:tc>
-          <w:tcPr>
-            <w:tcW w:w="893" w:type="pct"/>
-          </w:tcPr>
-          <w:p>
-            <w:pPr>
-              <w:bidi w:val="0"/>
-              <w:rPr>
-                <w:rFonts w:asciiTheme="minorBidi" w:hAnsiTheme="minorBidi"/>
-                <w:sz w:val="24"/>
-                <w:szCs w:val="24"/>
-              </w:rPr>
-            </w:pPr>
-          </w:p>
-        </w:tc>
-        <w:tc>
-          <w:tcPr>
-            <w:tcW w:w="1209" w:type="pct"/>
-            <w:vAlign w:val="center"/>
-          </w:tcPr>
-          <w:p>
-            <w:pPr>
-              <w:bidi w:val="0"/>
-              <w:rPr>
-                <w:rFonts w:asciiTheme="minorBidi" w:hAnsiTheme="minorBidi"/>
-                <w:sz w:val="24"/>
-                <w:szCs w:val="24"/>
-              </w:rPr>
-            </w:pPr>
-          </w:p>
-        </w:tc>
-      </w:tr>
-      <w:tr>
-        <w:tc>
-          <w:tcPr>
-            <w:tcW w:w="596" w:type="pct"/>
-            <w:vAlign w:val="center"/>
-          </w:tcPr>
-          <w:p>
-            <w:pPr>
-              <w:bidi w:val="0"/>
-              <w:rPr>
-                <w:rFonts w:asciiTheme="minorBidi" w:hAnsiTheme="minorBidi"/>
-                <w:color w:val="FF0000"/>
-                <w:sz w:val="24"/>
-                <w:szCs w:val="24"/>
-              </w:rPr>
-            </w:pPr>
-            <w:r>
-              <w:rPr>
-                <w:rFonts w:asciiTheme="minorBidi" w:hAnsiTheme="minorBidi"/>
-                <w:color w:val="FF0000"/>
-                <w:sz w:val="24"/>
-                <w:szCs w:val="24"/>
-              </w:rPr>
-              <w:t>PBL</w:t>
-            </w:r>
-          </w:p>
-        </w:tc>
-        <w:tc>
-          <w:tcPr>
-            <w:tcW w:w="2302" w:type="pct"/>
-            <w:vAlign w:val="center"/>
-          </w:tcPr>
-          <w:p>
-            <w:pPr>
-              <w:bidi w:val="0"/>
-              <w:rPr>
-                <w:rFonts w:asciiTheme="minorBidi" w:hAnsiTheme="minorBidi"/>
-                <w:sz w:val="24"/>
-                <w:szCs w:val="24"/>
-              </w:rPr>
-            </w:pPr>
-            <w:r>
-              <w:rPr>
-                <w:rFonts w:asciiTheme="minorBidi" w:hAnsiTheme="minorBidi"/>
-                <w:color w:val="FF0000"/>
-                <w:sz w:val="24"/>
-                <w:szCs w:val="24"/>
-              </w:rPr>
-              <w:t>As a restaurant representative, I would like to update the restaurant's regular opening hours.</w:t>
-            </w:r>
-          </w:p>
-        </w:tc>
-        <w:tc>
-          <w:tcPr>
-            <w:tcW w:w="893" w:type="pct"/>
-          </w:tcPr>
-          <w:p>
-            <w:pPr>
-              <w:bidi w:val="0"/>
-              <w:rPr>
-                <w:rFonts w:asciiTheme="minorBidi" w:hAnsiTheme="minorBidi"/>
-                <w:sz w:val="24"/>
-                <w:szCs w:val="24"/>
-              </w:rPr>
-            </w:pPr>
-          </w:p>
-        </w:tc>
-        <w:tc>
-          <w:tcPr>
-            <w:tcW w:w="1209" w:type="pct"/>
-            <w:vAlign w:val="center"/>
-          </w:tcPr>
-          <w:p>
-            <w:pPr>
-              <w:bidi w:val="0"/>
-              <w:rPr>
-                <w:rFonts w:asciiTheme="minorBidi" w:hAnsiTheme="minorBidi"/>
-                <w:sz w:val="24"/>
-                <w:szCs w:val="24"/>
-              </w:rPr>
-            </w:pPr>
-          </w:p>
-        </w:tc>
-      </w:tr>
-      <w:tr>
-        <w:tc>
-          <w:tcPr>
-            <w:tcW w:w="596" w:type="pct"/>
-            <w:vAlign w:val="center"/>
-          </w:tcPr>
-          <w:p>
-            <w:pPr>
-              <w:bidi w:val="0"/>
-              <w:rPr>
-                <w:rFonts w:asciiTheme="minorBidi" w:hAnsiTheme="minorBidi"/>
-                <w:color w:val="FF0000"/>
-                <w:sz w:val="24"/>
-                <w:szCs w:val="24"/>
-              </w:rPr>
-            </w:pPr>
-            <w:r>
-              <w:rPr>
-                <w:rFonts w:asciiTheme="minorBidi" w:hAnsiTheme="minorBidi"/>
-                <w:color w:val="FF0000"/>
-                <w:sz w:val="24"/>
-                <w:szCs w:val="24"/>
-              </w:rPr>
-              <w:t>PBL</w:t>
-            </w:r>
-          </w:p>
-        </w:tc>
-        <w:tc>
-          <w:tcPr>
-            <w:tcW w:w="2302" w:type="pct"/>
-            <w:vAlign w:val="center"/>
-          </w:tcPr>
-          <w:p>
-            <w:pPr>
-              <w:bidi w:val="0"/>
-              <w:rPr>
-                <w:rFonts w:asciiTheme="minorBidi" w:hAnsiTheme="minorBidi"/>
-                <w:sz w:val="24"/>
-                <w:szCs w:val="24"/>
-              </w:rPr>
-            </w:pPr>
-            <w:r>
-              <w:rPr>
-                <w:rFonts w:asciiTheme="minorBidi" w:hAnsiTheme="minorBidi"/>
-                <w:color w:val="FF0000"/>
-                <w:sz w:val="24"/>
-                <w:szCs w:val="24"/>
-              </w:rPr>
-              <w:t>As a system, I want to provide a 10% discount on the bill for subscribers.</w:t>
-            </w:r>
-          </w:p>
-        </w:tc>
-        <w:tc>
-          <w:tcPr>
-            <w:tcW w:w="893" w:type="pct"/>
-          </w:tcPr>
-          <w:p>
-            <w:pPr>
-              <w:bidi w:val="0"/>
-              <w:rPr>
-                <w:rFonts w:asciiTheme="minorBidi" w:hAnsiTheme="minorBidi"/>
-                <w:sz w:val="24"/>
-                <w:szCs w:val="24"/>
-              </w:rPr>
-            </w:pPr>
-          </w:p>
-        </w:tc>
-        <w:tc>
-          <w:tcPr>
-            <w:tcW w:w="1209" w:type="pct"/>
-            <w:vAlign w:val="center"/>
-          </w:tcPr>
-          <w:p>
-            <w:pPr>
-              <w:bidi w:val="0"/>
-              <w:rPr>
-                <w:rFonts w:asciiTheme="minorBidi" w:hAnsiTheme="minorBidi"/>
-                <w:sz w:val="24"/>
-                <w:szCs w:val="24"/>
-              </w:rPr>
-            </w:pPr>
           </w:p>
         </w:tc>
       </w:tr>

</xml_diff>